<commit_message>
Update - New Functionalyt
</commit_message>
<xml_diff>
--- a/docs/word/01-HLD-High-Level-Design.docx
+++ b/docs/word/01-HLD-High-Level-Design.docx
@@ -11,7 +11,7 @@
           <w:noProof/>
         </w:rPr>
         <w:drawing>
-          <wp:inline distT="0" distB="0" distL="0" distR="0" wp14:anchorId="563BA922" wp14:editId="49D45D42">
+          <wp:inline distT="0" distB="0" distL="0" distR="0" wp14:anchorId="6EC0B446" wp14:editId="71D0E2D4">
             <wp:extent cx="1981200" cy="771525"/>
             <wp:effectExtent l="0" t="0" r="0" b="0"/>
             <wp:docPr id="1" name="Immagine 1"/>
@@ -298,11 +298,15 @@
           <w:p>
             <w:pPr>
               <w:spacing w:after="0" w:line="264" w:lineRule="auto"/>
-            </w:pPr>
-            <w:r>
-              <w:rPr>
-                <w:sz w:val="19"/>
-                <w:szCs w:val="19"/>
+              <w:rPr>
+                <w:lang w:val="fr-FR"/>
+              </w:rPr>
+            </w:pPr>
+            <w:r>
+              <w:rPr>
+                <w:sz w:val="19"/>
+                <w:szCs w:val="19"/>
+                <w:lang w:val="fr-FR"/>
               </w:rPr>
               <w:t>Guest Portal — Cisco Catalyst 9800 Guest Management Desk</w:t>
             </w:r>
@@ -343,7 +347,7 @@
                 <w:sz w:val="19"/>
                 <w:szCs w:val="19"/>
               </w:rPr>
-              <w:t>Documento</w:t>
+              <w:t>Indirizzo (produzione)</w:t>
             </w:r>
           </w:p>
         </w:tc>
@@ -374,7 +378,7 @@
                 <w:sz w:val="19"/>
                 <w:szCs w:val="19"/>
               </w:rPr>
-              <w:t>HLD — High Level Design</w:t>
+              <w:t>https://guestportal.dompe.com</w:t>
             </w:r>
           </w:p>
         </w:tc>
@@ -413,7 +417,7 @@
                 <w:sz w:val="19"/>
                 <w:szCs w:val="19"/>
               </w:rPr>
-              <w:t>Versione</w:t>
+              <w:t>Documento</w:t>
             </w:r>
           </w:p>
         </w:tc>
@@ -444,7 +448,7 @@
                 <w:sz w:val="19"/>
                 <w:szCs w:val="19"/>
               </w:rPr>
-              <w:t>1.0</w:t>
+              <w:t>HLD — High Level Design</w:t>
             </w:r>
           </w:p>
         </w:tc>
@@ -483,7 +487,7 @@
                 <w:sz w:val="19"/>
                 <w:szCs w:val="19"/>
               </w:rPr>
-              <w:t>Data di emissione</w:t>
+              <w:t>Versione</w:t>
             </w:r>
           </w:p>
         </w:tc>
@@ -514,7 +518,7 @@
                 <w:sz w:val="19"/>
                 <w:szCs w:val="19"/>
               </w:rPr>
-              <w:t>22 settembre 2026</w:t>
+              <w:t>1.0</w:t>
             </w:r>
           </w:p>
         </w:tc>
@@ -553,7 +557,7 @@
                 <w:sz w:val="19"/>
                 <w:szCs w:val="19"/>
               </w:rPr>
-              <w:t>Stato</w:t>
+              <w:t>Data di emissione</w:t>
             </w:r>
           </w:p>
         </w:tc>
@@ -584,7 +588,7 @@
                 <w:sz w:val="19"/>
                 <w:szCs w:val="19"/>
               </w:rPr>
-              <w:t>Emesso</w:t>
+              <w:t>25 settembre 2026</w:t>
             </w:r>
           </w:p>
         </w:tc>
@@ -623,7 +627,7 @@
                 <w:sz w:val="19"/>
                 <w:szCs w:val="19"/>
               </w:rPr>
-              <w:t>Destinatari</w:t>
+              <w:t>Stato</w:t>
             </w:r>
           </w:p>
         </w:tc>
@@ -654,7 +658,7 @@
                 <w:sz w:val="19"/>
                 <w:szCs w:val="19"/>
               </w:rPr>
-              <w:t>IT Infrastructure, Security, Sviluppo, Service Desk</w:t>
+              <w:t>Emesso</w:t>
             </w:r>
           </w:p>
         </w:tc>
@@ -693,7 +697,7 @@
                 <w:sz w:val="19"/>
                 <w:szCs w:val="19"/>
               </w:rPr>
-              <w:t>Classificazione</w:t>
+              <w:t>Destinatari</w:t>
             </w:r>
           </w:p>
         </w:tc>
@@ -724,7 +728,7 @@
                 <w:sz w:val="19"/>
                 <w:szCs w:val="19"/>
               </w:rPr>
-              <w:t>Uso interno</w:t>
+              <w:t>IT Infrastructure, Security, Sviluppo, Service Desk</w:t>
             </w:r>
           </w:p>
         </w:tc>
@@ -763,7 +767,7 @@
                 <w:sz w:val="19"/>
                 <w:szCs w:val="19"/>
               </w:rPr>
-              <w:t>Repository di riferimento</w:t>
+              <w:t>Classificazione</w:t>
             </w:r>
           </w:p>
         </w:tc>
@@ -794,7 +798,7 @@
                 <w:sz w:val="19"/>
                 <w:szCs w:val="19"/>
               </w:rPr>
-              <w:t>github.com/ACF-Dompe/Centralino</w:t>
+              <w:t>Uso interno</w:t>
             </w:r>
           </w:p>
         </w:tc>
@@ -833,6 +837,76 @@
                 <w:sz w:val="19"/>
                 <w:szCs w:val="19"/>
               </w:rPr>
+              <w:t>Repository di riferimento</w:t>
+            </w:r>
+          </w:p>
+        </w:tc>
+        <w:tc>
+          <w:tcPr>
+            <w:tcW w:w="6747" w:type="dxa"/>
+            <w:tcBorders>
+              <w:top w:val="single" w:sz="4" w:space="0" w:color="D9D9D9"/>
+              <w:left w:val="single" w:sz="4" w:space="0" w:color="D9D9D9"/>
+              <w:bottom w:val="single" w:sz="4" w:space="0" w:color="D9D9D9"/>
+              <w:right w:val="single" w:sz="4" w:space="0" w:color="D9D9D9"/>
+            </w:tcBorders>
+            <w:shd w:val="clear" w:color="auto" w:fill="FFFFFF"/>
+            <w:tcMar>
+              <w:top w:w="70" w:type="dxa"/>
+              <w:left w:w="110" w:type="dxa"/>
+              <w:bottom w:w="70" w:type="dxa"/>
+              <w:right w:w="110" w:type="dxa"/>
+            </w:tcMar>
+            <w:vAlign w:val="center"/>
+          </w:tcPr>
+          <w:p>
+            <w:pPr>
+              <w:spacing w:after="0" w:line="264" w:lineRule="auto"/>
+            </w:pPr>
+            <w:r>
+              <w:rPr>
+                <w:sz w:val="19"/>
+                <w:szCs w:val="19"/>
+              </w:rPr>
+              <w:t>github.com/ACF-Dompe/Centralino</w:t>
+            </w:r>
+          </w:p>
+        </w:tc>
+      </w:tr>
+      <w:tr>
+        <w:tblPrEx>
+          <w:tblCellMar>
+            <w:top w:w="0" w:type="dxa"/>
+            <w:bottom w:w="0" w:type="dxa"/>
+          </w:tblCellMar>
+        </w:tblPrEx>
+        <w:tc>
+          <w:tcPr>
+            <w:tcW w:w="2891" w:type="dxa"/>
+            <w:tcBorders>
+              <w:top w:val="single" w:sz="4" w:space="0" w:color="D9D9D9"/>
+              <w:left w:val="single" w:sz="4" w:space="0" w:color="D9D9D9"/>
+              <w:bottom w:val="single" w:sz="4" w:space="0" w:color="D9D9D9"/>
+              <w:right w:val="single" w:sz="4" w:space="0" w:color="D9D9D9"/>
+            </w:tcBorders>
+            <w:shd w:val="clear" w:color="auto" w:fill="F0F0F0"/>
+            <w:tcMar>
+              <w:top w:w="70" w:type="dxa"/>
+              <w:left w:w="110" w:type="dxa"/>
+              <w:bottom w:w="70" w:type="dxa"/>
+              <w:right w:w="110" w:type="dxa"/>
+            </w:tcMar>
+            <w:vAlign w:val="center"/>
+          </w:tcPr>
+          <w:p>
+            <w:pPr>
+              <w:spacing w:after="0" w:line="264" w:lineRule="auto"/>
+            </w:pPr>
+            <w:r>
+              <w:rPr>
+                <w:sz w:val="19"/>
+                <w:szCs w:val="19"/>
+              </w:rPr>
               <w:t>Revisione del codice</w:t>
             </w:r>
           </w:p>
@@ -846,7 +920,7 @@
               <w:bottom w:val="single" w:sz="4" w:space="0" w:color="D9D9D9"/>
               <w:right w:val="single" w:sz="4" w:space="0" w:color="D9D9D9"/>
             </w:tcBorders>
-            <w:shd w:val="clear" w:color="auto" w:fill="FFFFFF"/>
+            <w:shd w:val="clear" w:color="auto" w:fill="F0F0F0"/>
             <w:tcMar>
               <w:top w:w="70" w:type="dxa"/>
               <w:left w:w="110" w:type="dxa"/>
@@ -896,7 +970,7 @@
     <w:sdt>
       <w:sdtPr>
         <w:alias w:val="Indice"/>
-        <w:id w:val="730583920"/>
+        <w:id w:val="-2069254419"/>
       </w:sdtPr>
       <w:sdtContent>
         <w:p>
@@ -918,7 +992,7 @@
           <w:r>
             <w:fldChar w:fldCharType="separate"/>
           </w:r>
-          <w:hyperlink w:anchor="_Toc240987600" w:history="1">
+          <w:hyperlink w:anchor="_Toc241222137" w:history="1">
             <w:r>
               <w:rPr>
                 <w:rStyle w:val="Collegamentoipertestuale"/>
@@ -942,7 +1016,7 @@
               <w:rPr>
                 <w:noProof/>
               </w:rPr>
-              <w:instrText xml:space="preserve"> PAGEREF _Toc240987600 \h </w:instrText>
+              <w:instrText xml:space="preserve"> PAGEREF _Toc241222137 \h </w:instrText>
             </w:r>
             <w:r>
               <w:rPr>
@@ -979,7 +1053,7 @@
               <w:noProof/>
             </w:rPr>
           </w:pPr>
-          <w:hyperlink w:anchor="_Toc240987601" w:history="1">
+          <w:hyperlink w:anchor="_Toc241222138" w:history="1">
             <w:r>
               <w:rPr>
                 <w:rStyle w:val="Collegamentoipertestuale"/>
@@ -1003,7 +1077,7 @@
               <w:rPr>
                 <w:noProof/>
               </w:rPr>
-              <w:instrText xml:space="preserve"> PAGEREF _Toc240987601 \h </w:instrText>
+              <w:instrText xml:space="preserve"> PAGEREF _Toc241222138 \h </w:instrText>
             </w:r>
             <w:r>
               <w:rPr>
@@ -1040,7 +1114,7 @@
               <w:noProof/>
             </w:rPr>
           </w:pPr>
-          <w:hyperlink w:anchor="_Toc240987602" w:history="1">
+          <w:hyperlink w:anchor="_Toc241222139" w:history="1">
             <w:r>
               <w:rPr>
                 <w:rStyle w:val="Collegamentoipertestuale"/>
@@ -1064,7 +1138,7 @@
               <w:rPr>
                 <w:noProof/>
               </w:rPr>
-              <w:instrText xml:space="preserve"> PAGEREF _Toc240987602 \h </w:instrText>
+              <w:instrText xml:space="preserve"> PAGEREF _Toc241222139 \h </w:instrText>
             </w:r>
             <w:r>
               <w:rPr>
@@ -1101,7 +1175,7 @@
               <w:noProof/>
             </w:rPr>
           </w:pPr>
-          <w:hyperlink w:anchor="_Toc240987603" w:history="1">
+          <w:hyperlink w:anchor="_Toc241222140" w:history="1">
             <w:r>
               <w:rPr>
                 <w:rStyle w:val="Collegamentoipertestuale"/>
@@ -1125,7 +1199,7 @@
               <w:rPr>
                 <w:noProof/>
               </w:rPr>
-              <w:instrText xml:space="preserve"> PAGEREF _Toc240987603 \h </w:instrText>
+              <w:instrText xml:space="preserve"> PAGEREF _Toc241222140 \h </w:instrText>
             </w:r>
             <w:r>
               <w:rPr>
@@ -1162,7 +1236,7 @@
               <w:noProof/>
             </w:rPr>
           </w:pPr>
-          <w:hyperlink w:anchor="_Toc240987604" w:history="1">
+          <w:hyperlink w:anchor="_Toc241222141" w:history="1">
             <w:r>
               <w:rPr>
                 <w:rStyle w:val="Collegamentoipertestuale"/>
@@ -1186,7 +1260,7 @@
               <w:rPr>
                 <w:noProof/>
               </w:rPr>
-              <w:instrText xml:space="preserve"> PAGEREF _Toc240987604 \h </w:instrText>
+              <w:instrText xml:space="preserve"> PAGEREF _Toc241222141 \h </w:instrText>
             </w:r>
             <w:r>
               <w:rPr>
@@ -1223,7 +1297,7 @@
               <w:noProof/>
             </w:rPr>
           </w:pPr>
-          <w:hyperlink w:anchor="_Toc240987605" w:history="1">
+          <w:hyperlink w:anchor="_Toc241222142" w:history="1">
             <w:r>
               <w:rPr>
                 <w:rStyle w:val="Collegamentoipertestuale"/>
@@ -1247,7 +1321,7 @@
               <w:rPr>
                 <w:noProof/>
               </w:rPr>
-              <w:instrText xml:space="preserve"> PAGEREF _Toc240987605 \h </w:instrText>
+              <w:instrText xml:space="preserve"> PAGEREF _Toc241222142 \h </w:instrText>
             </w:r>
             <w:r>
               <w:rPr>
@@ -1284,7 +1358,7 @@
               <w:noProof/>
             </w:rPr>
           </w:pPr>
-          <w:hyperlink w:anchor="_Toc240987606" w:history="1">
+          <w:hyperlink w:anchor="_Toc241222143" w:history="1">
             <w:r>
               <w:rPr>
                 <w:rStyle w:val="Collegamentoipertestuale"/>
@@ -1308,7 +1382,7 @@
               <w:rPr>
                 <w:noProof/>
               </w:rPr>
-              <w:instrText xml:space="preserve"> PAGEREF _Toc240987606 \h </w:instrText>
+              <w:instrText xml:space="preserve"> PAGEREF _Toc241222143 \h </w:instrText>
             </w:r>
             <w:r>
               <w:rPr>
@@ -1345,7 +1419,7 @@
               <w:noProof/>
             </w:rPr>
           </w:pPr>
-          <w:hyperlink w:anchor="_Toc240987607" w:history="1">
+          <w:hyperlink w:anchor="_Toc241222144" w:history="1">
             <w:r>
               <w:rPr>
                 <w:rStyle w:val="Collegamentoipertestuale"/>
@@ -1369,7 +1443,7 @@
               <w:rPr>
                 <w:noProof/>
               </w:rPr>
-              <w:instrText xml:space="preserve"> PAGEREF _Toc240987607 \h </w:instrText>
+              <w:instrText xml:space="preserve"> PAGEREF _Toc241222144 \h </w:instrText>
             </w:r>
             <w:r>
               <w:rPr>
@@ -1406,7 +1480,7 @@
               <w:noProof/>
             </w:rPr>
           </w:pPr>
-          <w:hyperlink w:anchor="_Toc240987608" w:history="1">
+          <w:hyperlink w:anchor="_Toc241222145" w:history="1">
             <w:r>
               <w:rPr>
                 <w:rStyle w:val="Collegamentoipertestuale"/>
@@ -1430,7 +1504,7 @@
               <w:rPr>
                 <w:noProof/>
               </w:rPr>
-              <w:instrText xml:space="preserve"> PAGEREF _Toc240987608 \h </w:instrText>
+              <w:instrText xml:space="preserve"> PAGEREF _Toc241222145 \h </w:instrText>
             </w:r>
             <w:r>
               <w:rPr>
@@ -1467,7 +1541,7 @@
               <w:noProof/>
             </w:rPr>
           </w:pPr>
-          <w:hyperlink w:anchor="_Toc240987609" w:history="1">
+          <w:hyperlink w:anchor="_Toc241222146" w:history="1">
             <w:r>
               <w:rPr>
                 <w:rStyle w:val="Collegamentoipertestuale"/>
@@ -1491,7 +1565,7 @@
               <w:rPr>
                 <w:noProof/>
               </w:rPr>
-              <w:instrText xml:space="preserve"> PAGEREF _Toc240987609 \h </w:instrText>
+              <w:instrText xml:space="preserve"> PAGEREF _Toc241222146 \h </w:instrText>
             </w:r>
             <w:r>
               <w:rPr>
@@ -1528,7 +1602,7 @@
               <w:noProof/>
             </w:rPr>
           </w:pPr>
-          <w:hyperlink w:anchor="_Toc240987610" w:history="1">
+          <w:hyperlink w:anchor="_Toc241222147" w:history="1">
             <w:r>
               <w:rPr>
                 <w:rStyle w:val="Collegamentoipertestuale"/>
@@ -1552,7 +1626,7 @@
               <w:rPr>
                 <w:noProof/>
               </w:rPr>
-              <w:instrText xml:space="preserve"> PAGEREF _Toc240987610 \h </w:instrText>
+              <w:instrText xml:space="preserve"> PAGEREF _Toc241222147 \h </w:instrText>
             </w:r>
             <w:r>
               <w:rPr>
@@ -1589,7 +1663,7 @@
               <w:noProof/>
             </w:rPr>
           </w:pPr>
-          <w:hyperlink w:anchor="_Toc240987611" w:history="1">
+          <w:hyperlink w:anchor="_Toc241222148" w:history="1">
             <w:r>
               <w:rPr>
                 <w:rStyle w:val="Collegamentoipertestuale"/>
@@ -1613,7 +1687,7 @@
               <w:rPr>
                 <w:noProof/>
               </w:rPr>
-              <w:instrText xml:space="preserve"> PAGEREF _Toc240987611 \h </w:instrText>
+              <w:instrText xml:space="preserve"> PAGEREF _Toc241222148 \h </w:instrText>
             </w:r>
             <w:r>
               <w:rPr>
@@ -1650,7 +1724,7 @@
               <w:noProof/>
             </w:rPr>
           </w:pPr>
-          <w:hyperlink w:anchor="_Toc240987612" w:history="1">
+          <w:hyperlink w:anchor="_Toc241222149" w:history="1">
             <w:r>
               <w:rPr>
                 <w:rStyle w:val="Collegamentoipertestuale"/>
@@ -1674,7 +1748,7 @@
               <w:rPr>
                 <w:noProof/>
               </w:rPr>
-              <w:instrText xml:space="preserve"> PAGEREF _Toc240987612 \h </w:instrText>
+              <w:instrText xml:space="preserve"> PAGEREF _Toc241222149 \h </w:instrText>
             </w:r>
             <w:r>
               <w:rPr>
@@ -1711,7 +1785,7 @@
               <w:noProof/>
             </w:rPr>
           </w:pPr>
-          <w:hyperlink w:anchor="_Toc240987613" w:history="1">
+          <w:hyperlink w:anchor="_Toc241222150" w:history="1">
             <w:r>
               <w:rPr>
                 <w:rStyle w:val="Collegamentoipertestuale"/>
@@ -1735,7 +1809,7 @@
               <w:rPr>
                 <w:noProof/>
               </w:rPr>
-              <w:instrText xml:space="preserve"> PAGEREF _Toc240987613 \h </w:instrText>
+              <w:instrText xml:space="preserve"> PAGEREF _Toc241222150 \h </w:instrText>
             </w:r>
             <w:r>
               <w:rPr>
@@ -1772,7 +1846,7 @@
               <w:noProof/>
             </w:rPr>
           </w:pPr>
-          <w:hyperlink w:anchor="_Toc240987614" w:history="1">
+          <w:hyperlink w:anchor="_Toc241222151" w:history="1">
             <w:r>
               <w:rPr>
                 <w:rStyle w:val="Collegamentoipertestuale"/>
@@ -1796,7 +1870,7 @@
               <w:rPr>
                 <w:noProof/>
               </w:rPr>
-              <w:instrText xml:space="preserve"> PAGEREF _Toc240987614 \h </w:instrText>
+              <w:instrText xml:space="preserve"> PAGEREF _Toc241222151 \h </w:instrText>
             </w:r>
             <w:r>
               <w:rPr>
@@ -1833,7 +1907,7 @@
               <w:noProof/>
             </w:rPr>
           </w:pPr>
-          <w:hyperlink w:anchor="_Toc240987615" w:history="1">
+          <w:hyperlink w:anchor="_Toc241222152" w:history="1">
             <w:r>
               <w:rPr>
                 <w:rStyle w:val="Collegamentoipertestuale"/>
@@ -1857,7 +1931,7 @@
               <w:rPr>
                 <w:noProof/>
               </w:rPr>
-              <w:instrText xml:space="preserve"> PAGEREF _Toc240987615 \h </w:instrText>
+              <w:instrText xml:space="preserve"> PAGEREF _Toc241222152 \h </w:instrText>
             </w:r>
             <w:r>
               <w:rPr>
@@ -1894,7 +1968,7 @@
               <w:noProof/>
             </w:rPr>
           </w:pPr>
-          <w:hyperlink w:anchor="_Toc240987616" w:history="1">
+          <w:hyperlink w:anchor="_Toc241222153" w:history="1">
             <w:r>
               <w:rPr>
                 <w:rStyle w:val="Collegamentoipertestuale"/>
@@ -1918,7 +1992,7 @@
               <w:rPr>
                 <w:noProof/>
               </w:rPr>
-              <w:instrText xml:space="preserve"> PAGEREF _Toc240987616 \h </w:instrText>
+              <w:instrText xml:space="preserve"> PAGEREF _Toc241222153 \h </w:instrText>
             </w:r>
             <w:r>
               <w:rPr>
@@ -1955,7 +2029,7 @@
               <w:noProof/>
             </w:rPr>
           </w:pPr>
-          <w:hyperlink w:anchor="_Toc240987617" w:history="1">
+          <w:hyperlink w:anchor="_Toc241222154" w:history="1">
             <w:r>
               <w:rPr>
                 <w:rStyle w:val="Collegamentoipertestuale"/>
@@ -1979,7 +2053,7 @@
               <w:rPr>
                 <w:noProof/>
               </w:rPr>
-              <w:instrText xml:space="preserve"> PAGEREF _Toc240987617 \h </w:instrText>
+              <w:instrText xml:space="preserve"> PAGEREF _Toc241222154 \h </w:instrText>
             </w:r>
             <w:r>
               <w:rPr>
@@ -2016,7 +2090,7 @@
               <w:noProof/>
             </w:rPr>
           </w:pPr>
-          <w:hyperlink w:anchor="_Toc240987618" w:history="1">
+          <w:hyperlink w:anchor="_Toc241222155" w:history="1">
             <w:r>
               <w:rPr>
                 <w:rStyle w:val="Collegamentoipertestuale"/>
@@ -2040,7 +2114,7 @@
               <w:rPr>
                 <w:noProof/>
               </w:rPr>
-              <w:instrText xml:space="preserve"> PAGEREF _Toc240987618 \h </w:instrText>
+              <w:instrText xml:space="preserve"> PAGEREF _Toc241222155 \h </w:instrText>
             </w:r>
             <w:r>
               <w:rPr>
@@ -2077,7 +2151,7 @@
               <w:noProof/>
             </w:rPr>
           </w:pPr>
-          <w:hyperlink w:anchor="_Toc240987619" w:history="1">
+          <w:hyperlink w:anchor="_Toc241222156" w:history="1">
             <w:r>
               <w:rPr>
                 <w:rStyle w:val="Collegamentoipertestuale"/>
@@ -2101,7 +2175,7 @@
               <w:rPr>
                 <w:noProof/>
               </w:rPr>
-              <w:instrText xml:space="preserve"> PAGEREF _Toc240987619 \h </w:instrText>
+              <w:instrText xml:space="preserve"> PAGEREF _Toc241222156 \h </w:instrText>
             </w:r>
             <w:r>
               <w:rPr>
@@ -2138,7 +2212,7 @@
               <w:noProof/>
             </w:rPr>
           </w:pPr>
-          <w:hyperlink w:anchor="_Toc240987620" w:history="1">
+          <w:hyperlink w:anchor="_Toc241222157" w:history="1">
             <w:r>
               <w:rPr>
                 <w:rStyle w:val="Collegamentoipertestuale"/>
@@ -2162,7 +2236,7 @@
               <w:rPr>
                 <w:noProof/>
               </w:rPr>
-              <w:instrText xml:space="preserve"> PAGEREF _Toc240987620 \h </w:instrText>
+              <w:instrText xml:space="preserve"> PAGEREF _Toc241222157 \h </w:instrText>
             </w:r>
             <w:r>
               <w:rPr>
@@ -2199,7 +2273,7 @@
               <w:noProof/>
             </w:rPr>
           </w:pPr>
-          <w:hyperlink w:anchor="_Toc240987621" w:history="1">
+          <w:hyperlink w:anchor="_Toc241222158" w:history="1">
             <w:r>
               <w:rPr>
                 <w:rStyle w:val="Collegamentoipertestuale"/>
@@ -2223,7 +2297,7 @@
               <w:rPr>
                 <w:noProof/>
               </w:rPr>
-              <w:instrText xml:space="preserve"> PAGEREF _Toc240987621 \h </w:instrText>
+              <w:instrText xml:space="preserve"> PAGEREF _Toc241222158 \h </w:instrText>
             </w:r>
             <w:r>
               <w:rPr>
@@ -2260,7 +2334,7 @@
               <w:noProof/>
             </w:rPr>
           </w:pPr>
-          <w:hyperlink w:anchor="_Toc240987622" w:history="1">
+          <w:hyperlink w:anchor="_Toc241222159" w:history="1">
             <w:r>
               <w:rPr>
                 <w:rStyle w:val="Collegamentoipertestuale"/>
@@ -2284,7 +2358,7 @@
               <w:rPr>
                 <w:noProof/>
               </w:rPr>
-              <w:instrText xml:space="preserve"> PAGEREF _Toc240987622 \h </w:instrText>
+              <w:instrText xml:space="preserve"> PAGEREF _Toc241222159 \h </w:instrText>
             </w:r>
             <w:r>
               <w:rPr>
@@ -2321,7 +2395,7 @@
               <w:noProof/>
             </w:rPr>
           </w:pPr>
-          <w:hyperlink w:anchor="_Toc240987623" w:history="1">
+          <w:hyperlink w:anchor="_Toc241222160" w:history="1">
             <w:r>
               <w:rPr>
                 <w:rStyle w:val="Collegamentoipertestuale"/>
@@ -2345,7 +2419,7 @@
               <w:rPr>
                 <w:noProof/>
               </w:rPr>
-              <w:instrText xml:space="preserve"> PAGEREF _Toc240987623 \h </w:instrText>
+              <w:instrText xml:space="preserve"> PAGEREF _Toc241222160 \h </w:instrText>
             </w:r>
             <w:r>
               <w:rPr>
@@ -2382,7 +2456,7 @@
               <w:noProof/>
             </w:rPr>
           </w:pPr>
-          <w:hyperlink w:anchor="_Toc240987624" w:history="1">
+          <w:hyperlink w:anchor="_Toc241222161" w:history="1">
             <w:r>
               <w:rPr>
                 <w:rStyle w:val="Collegamentoipertestuale"/>
@@ -2406,7 +2480,7 @@
               <w:rPr>
                 <w:noProof/>
               </w:rPr>
-              <w:instrText xml:space="preserve"> PAGEREF _Toc240987624 \h </w:instrText>
+              <w:instrText xml:space="preserve"> PAGEREF _Toc241222161 \h </w:instrText>
             </w:r>
             <w:r>
               <w:rPr>
@@ -2443,7 +2517,7 @@
               <w:noProof/>
             </w:rPr>
           </w:pPr>
-          <w:hyperlink w:anchor="_Toc240987625" w:history="1">
+          <w:hyperlink w:anchor="_Toc241222162" w:history="1">
             <w:r>
               <w:rPr>
                 <w:rStyle w:val="Collegamentoipertestuale"/>
@@ -2467,7 +2541,7 @@
               <w:rPr>
                 <w:noProof/>
               </w:rPr>
-              <w:instrText xml:space="preserve"> PAGEREF _Toc240987625 \h </w:instrText>
+              <w:instrText xml:space="preserve"> PAGEREF _Toc241222162 \h </w:instrText>
             </w:r>
             <w:r>
               <w:rPr>
@@ -2504,7 +2578,7 @@
               <w:noProof/>
             </w:rPr>
           </w:pPr>
-          <w:hyperlink w:anchor="_Toc240987626" w:history="1">
+          <w:hyperlink w:anchor="_Toc241222163" w:history="1">
             <w:r>
               <w:rPr>
                 <w:rStyle w:val="Collegamentoipertestuale"/>
@@ -2528,7 +2602,7 @@
               <w:rPr>
                 <w:noProof/>
               </w:rPr>
-              <w:instrText xml:space="preserve"> PAGEREF _Toc240987626 \h </w:instrText>
+              <w:instrText xml:space="preserve"> PAGEREF _Toc241222163 \h </w:instrText>
             </w:r>
             <w:r>
               <w:rPr>
@@ -2565,7 +2639,7 @@
               <w:noProof/>
             </w:rPr>
           </w:pPr>
-          <w:hyperlink w:anchor="_Toc240987627" w:history="1">
+          <w:hyperlink w:anchor="_Toc241222164" w:history="1">
             <w:r>
               <w:rPr>
                 <w:rStyle w:val="Collegamentoipertestuale"/>
@@ -2589,7 +2663,7 @@
               <w:rPr>
                 <w:noProof/>
               </w:rPr>
-              <w:instrText xml:space="preserve"> PAGEREF _Toc240987627 \h </w:instrText>
+              <w:instrText xml:space="preserve"> PAGEREF _Toc241222164 \h </w:instrText>
             </w:r>
             <w:r>
               <w:rPr>
@@ -2626,7 +2700,7 @@
               <w:noProof/>
             </w:rPr>
           </w:pPr>
-          <w:hyperlink w:anchor="_Toc240987628" w:history="1">
+          <w:hyperlink w:anchor="_Toc241222165" w:history="1">
             <w:r>
               <w:rPr>
                 <w:rStyle w:val="Collegamentoipertestuale"/>
@@ -2650,7 +2724,7 @@
               <w:rPr>
                 <w:noProof/>
               </w:rPr>
-              <w:instrText xml:space="preserve"> PAGEREF _Toc240987628 \h </w:instrText>
+              <w:instrText xml:space="preserve"> PAGEREF _Toc241222165 \h </w:instrText>
             </w:r>
             <w:r>
               <w:rPr>
@@ -2687,7 +2761,7 @@
               <w:noProof/>
             </w:rPr>
           </w:pPr>
-          <w:hyperlink w:anchor="_Toc240987629" w:history="1">
+          <w:hyperlink w:anchor="_Toc241222166" w:history="1">
             <w:r>
               <w:rPr>
                 <w:rStyle w:val="Collegamentoipertestuale"/>
@@ -2711,7 +2785,7 @@
               <w:rPr>
                 <w:noProof/>
               </w:rPr>
-              <w:instrText xml:space="preserve"> PAGEREF _Toc240987629 \h </w:instrText>
+              <w:instrText xml:space="preserve"> PAGEREF _Toc241222166 \h </w:instrText>
             </w:r>
             <w:r>
               <w:rPr>
@@ -2748,7 +2822,7 @@
               <w:noProof/>
             </w:rPr>
           </w:pPr>
-          <w:hyperlink w:anchor="_Toc240987630" w:history="1">
+          <w:hyperlink w:anchor="_Toc241222167" w:history="1">
             <w:r>
               <w:rPr>
                 <w:rStyle w:val="Collegamentoipertestuale"/>
@@ -2772,7 +2846,7 @@
               <w:rPr>
                 <w:noProof/>
               </w:rPr>
-              <w:instrText xml:space="preserve"> PAGEREF _Toc240987630 \h </w:instrText>
+              <w:instrText xml:space="preserve"> PAGEREF _Toc241222167 \h </w:instrText>
             </w:r>
             <w:r>
               <w:rPr>
@@ -2809,7 +2883,7 @@
               <w:noProof/>
             </w:rPr>
           </w:pPr>
-          <w:hyperlink w:anchor="_Toc240987631" w:history="1">
+          <w:hyperlink w:anchor="_Toc241222168" w:history="1">
             <w:r>
               <w:rPr>
                 <w:rStyle w:val="Collegamentoipertestuale"/>
@@ -2833,7 +2907,7 @@
               <w:rPr>
                 <w:noProof/>
               </w:rPr>
-              <w:instrText xml:space="preserve"> PAGEREF _Toc240987631 \h </w:instrText>
+              <w:instrText xml:space="preserve"> PAGEREF _Toc241222168 \h </w:instrText>
             </w:r>
             <w:r>
               <w:rPr>
@@ -2870,7 +2944,7 @@
               <w:noProof/>
             </w:rPr>
           </w:pPr>
-          <w:hyperlink w:anchor="_Toc240987632" w:history="1">
+          <w:hyperlink w:anchor="_Toc241222169" w:history="1">
             <w:r>
               <w:rPr>
                 <w:rStyle w:val="Collegamentoipertestuale"/>
@@ -2894,7 +2968,7 @@
               <w:rPr>
                 <w:noProof/>
               </w:rPr>
-              <w:instrText xml:space="preserve"> PAGEREF _Toc240987632 \h </w:instrText>
+              <w:instrText xml:space="preserve"> PAGEREF _Toc241222169 \h </w:instrText>
             </w:r>
             <w:r>
               <w:rPr>
@@ -2938,7 +3012,7 @@
         </w:pBdr>
         <w:spacing w:after="220"/>
       </w:pPr>
-      <w:bookmarkStart w:id="0" w:name="_Toc240987600"/>
+      <w:bookmarkStart w:id="0" w:name="_Toc241222137"/>
       <w:r>
         <w:rPr>
           <w:color w:val="DC3230"/>
@@ -2974,7 +3048,7 @@
         <w:keepNext/>
         <w:spacing w:before="340" w:after="130"/>
       </w:pPr>
-      <w:bookmarkStart w:id="1" w:name="_Toc240987601"/>
+      <w:bookmarkStart w:id="1" w:name="_Toc241222138"/>
       <w:r>
         <w:rPr>
           <w:color w:val="DC3230"/>
@@ -3042,7 +3116,7 @@
         <w:keepNext/>
         <w:spacing w:before="340" w:after="130"/>
       </w:pPr>
-      <w:bookmarkStart w:id="2" w:name="_Toc240987602"/>
+      <w:bookmarkStart w:id="2" w:name="_Toc241222139"/>
       <w:r>
         <w:rPr>
           <w:color w:val="DC3230"/>
@@ -3464,7 +3538,7 @@
         <w:keepNext/>
         <w:spacing w:before="340" w:after="130"/>
       </w:pPr>
-      <w:bookmarkStart w:id="3" w:name="_Toc240987603"/>
+      <w:bookmarkStart w:id="3" w:name="_Toc241222140"/>
       <w:r>
         <w:rPr>
           <w:color w:val="DC3230"/>
@@ -4351,7 +4425,7 @@
         </w:pBdr>
         <w:spacing w:after="220"/>
       </w:pPr>
-      <w:bookmarkStart w:id="4" w:name="_Toc240987604"/>
+      <w:bookmarkStart w:id="4" w:name="_Toc241222141"/>
       <w:r>
         <w:rPr>
           <w:color w:val="DC3230"/>
@@ -4370,7 +4444,7 @@
         <w:keepNext/>
         <w:spacing w:before="340" w:after="130"/>
       </w:pPr>
-      <w:bookmarkStart w:id="5" w:name="_Toc240987605"/>
+      <w:bookmarkStart w:id="5" w:name="_Toc241222142"/>
       <w:r>
         <w:rPr>
           <w:color w:val="DC3230"/>
@@ -4417,7 +4491,7 @@
         <w:keepNext/>
         <w:spacing w:before="340" w:after="130"/>
       </w:pPr>
-      <w:bookmarkStart w:id="6" w:name="_Toc240987606"/>
+      <w:bookmarkStart w:id="6" w:name="_Toc241222143"/>
       <w:r>
         <w:rPr>
           <w:color w:val="DC3230"/>
@@ -5098,7 +5172,7 @@
         <w:keepNext/>
         <w:spacing w:before="340" w:after="130"/>
       </w:pPr>
-      <w:bookmarkStart w:id="7" w:name="_Toc240987607"/>
+      <w:bookmarkStart w:id="7" w:name="_Toc241222144"/>
       <w:r>
         <w:rPr>
           <w:color w:val="DC3230"/>
@@ -5140,7 +5214,7 @@
         <w:keepNext/>
         <w:spacing w:before="340" w:after="130"/>
       </w:pPr>
-      <w:bookmarkStart w:id="8" w:name="_Toc240987608"/>
+      <w:bookmarkStart w:id="8" w:name="_Toc241222145"/>
       <w:r>
         <w:rPr>
           <w:color w:val="DC3230"/>
@@ -6209,7 +6283,7 @@
         </w:pBdr>
         <w:spacing w:after="220"/>
       </w:pPr>
-      <w:bookmarkStart w:id="9" w:name="_Toc240987609"/>
+      <w:bookmarkStart w:id="9" w:name="_Toc241222146"/>
       <w:r>
         <w:rPr>
           <w:color w:val="DC3230"/>
@@ -6237,10 +6311,10 @@
           <w:noProof/>
         </w:rPr>
         <w:drawing>
-          <wp:inline distT="0" distB="0" distL="0" distR="0" wp14:anchorId="730A99FF" wp14:editId="78C2B07D">
+          <wp:inline distT="0" distB="0" distL="0" distR="0" wp14:anchorId="759AD387" wp14:editId="4FB1CD44">
             <wp:extent cx="6096000" cy="4648200"/>
             <wp:effectExtent l="0" t="0" r="0" b="0"/>
-            <wp:docPr id="1750494890" name="Immagine 1750494890"/>
+            <wp:docPr id="561601726" name="Immagine 561601726"/>
             <wp:cNvGraphicFramePr>
               <a:graphicFrameLocks xmlns:a="http://schemas.openxmlformats.org/drawingml/2006/main" noChangeAspect="1"/>
             </wp:cNvGraphicFramePr>
@@ -6308,7 +6382,7 @@
         <w:keepNext/>
         <w:spacing w:before="340" w:after="130"/>
       </w:pPr>
-      <w:bookmarkStart w:id="10" w:name="_Toc240987610"/>
+      <w:bookmarkStart w:id="10" w:name="_Toc241222147"/>
       <w:r>
         <w:rPr>
           <w:color w:val="DC3230"/>
@@ -6447,7 +6521,7 @@
         <w:keepNext/>
         <w:spacing w:before="340" w:after="130"/>
       </w:pPr>
-      <w:bookmarkStart w:id="11" w:name="_Toc240987611"/>
+      <w:bookmarkStart w:id="11" w:name="_Toc241222148"/>
       <w:r>
         <w:rPr>
           <w:color w:val="DC3230"/>
@@ -6650,11 +6724,15 @@
           <w:p>
             <w:pPr>
               <w:spacing w:after="0" w:line="264" w:lineRule="auto"/>
-            </w:pPr>
-            <w:r>
-              <w:rPr>
-                <w:sz w:val="19"/>
-                <w:szCs w:val="19"/>
+              <w:rPr>
+                <w:lang w:val="en-US"/>
+              </w:rPr>
+            </w:pPr>
+            <w:r>
+              <w:rPr>
+                <w:sz w:val="19"/>
+                <w:szCs w:val="19"/>
+                <w:lang w:val="en-US"/>
               </w:rPr>
               <w:t>React 18 · Vite · Tailwind · nginx 1.28 unprivileged</w:t>
             </w:r>
@@ -6751,11 +6829,15 @@
           <w:p>
             <w:pPr>
               <w:spacing w:after="0" w:line="264" w:lineRule="auto"/>
-            </w:pPr>
-            <w:r>
-              <w:rPr>
-                <w:sz w:val="19"/>
-                <w:szCs w:val="19"/>
+              <w:rPr>
+                <w:lang w:val="en-US"/>
+              </w:rPr>
+            </w:pPr>
+            <w:r>
+              <w:rPr>
+                <w:sz w:val="19"/>
+                <w:szCs w:val="19"/>
+                <w:lang w:val="en-US"/>
               </w:rPr>
               <w:t>Node.js 22 · Express · TypeScript (ESM)</w:t>
             </w:r>
@@ -6868,11 +6950,15 @@
           <w:p>
             <w:pPr>
               <w:spacing w:after="0" w:line="264" w:lineRule="auto"/>
-            </w:pPr>
-            <w:r>
-              <w:rPr>
-                <w:sz w:val="19"/>
-                <w:szCs w:val="19"/>
+              <w:rPr>
+                <w:lang w:val="en-US"/>
+              </w:rPr>
+            </w:pPr>
+            <w:r>
+              <w:rPr>
+                <w:sz w:val="19"/>
+                <w:szCs w:val="19"/>
+                <w:lang w:val="en-US"/>
               </w:rPr>
               <w:t>Azure Database for PostgreSQL Flexible Server</w:t>
             </w:r>
@@ -7070,11 +7156,15 @@
           <w:p>
             <w:pPr>
               <w:spacing w:after="0" w:line="264" w:lineRule="auto"/>
-            </w:pPr>
-            <w:r>
-              <w:rPr>
-                <w:sz w:val="19"/>
-                <w:szCs w:val="19"/>
+              <w:rPr>
+                <w:lang w:val="en-US"/>
+              </w:rPr>
+            </w:pPr>
+            <w:r>
+              <w:rPr>
+                <w:sz w:val="19"/>
+                <w:szCs w:val="19"/>
+                <w:lang w:val="en-US"/>
               </w:rPr>
               <w:t>Azure Application Gateway WAF v2</w:t>
             </w:r>
@@ -7665,7 +7755,7 @@
         <w:keepNext/>
         <w:spacing w:before="340" w:after="130"/>
       </w:pPr>
-      <w:bookmarkStart w:id="12" w:name="_Toc240987612"/>
+      <w:bookmarkStart w:id="12" w:name="_Toc241222149"/>
       <w:r>
         <w:rPr>
           <w:color w:val="DC3230"/>
@@ -7692,7 +7782,7 @@
         </w:pBdr>
         <w:spacing w:after="220"/>
       </w:pPr>
-      <w:bookmarkStart w:id="13" w:name="_Toc240987613"/>
+      <w:bookmarkStart w:id="13" w:name="_Toc241222150"/>
       <w:r>
         <w:rPr>
           <w:color w:val="DC3230"/>
@@ -7716,7 +7806,7 @@
         <w:keepNext/>
         <w:spacing w:before="340" w:after="130"/>
       </w:pPr>
-      <w:bookmarkStart w:id="14" w:name="_Toc240987614"/>
+      <w:bookmarkStart w:id="14" w:name="_Toc241222151"/>
       <w:r>
         <w:rPr>
           <w:color w:val="DC3230"/>
@@ -7796,7 +7886,7 @@
         <w:keepNext/>
         <w:spacing w:before="340" w:after="130"/>
       </w:pPr>
-      <w:bookmarkStart w:id="15" w:name="_Toc240987615"/>
+      <w:bookmarkStart w:id="15" w:name="_Toc241222152"/>
       <w:r>
         <w:rPr>
           <w:color w:val="DC3230"/>
@@ -7889,7 +7979,7 @@
         <w:keepNext/>
         <w:spacing w:before="340" w:after="130"/>
       </w:pPr>
-      <w:bookmarkStart w:id="16" w:name="_Toc240987616"/>
+      <w:bookmarkStart w:id="16" w:name="_Toc241222153"/>
       <w:r>
         <w:rPr>
           <w:color w:val="DC3230"/>
@@ -7922,7 +8012,7 @@
         <w:keepNext/>
         <w:spacing w:before="340" w:after="130"/>
       </w:pPr>
-      <w:bookmarkStart w:id="17" w:name="_Toc240987617"/>
+      <w:bookmarkStart w:id="17" w:name="_Toc241222154"/>
       <w:r>
         <w:rPr>
           <w:color w:val="DC3230"/>
@@ -7981,7 +8071,7 @@
         </w:pBdr>
         <w:spacing w:after="220"/>
       </w:pPr>
-      <w:bookmarkStart w:id="18" w:name="_Toc240987618"/>
+      <w:bookmarkStart w:id="18" w:name="_Toc241222155"/>
       <w:r>
         <w:rPr>
           <w:color w:val="DC3230"/>
@@ -8005,7 +8095,7 @@
         <w:keepNext/>
         <w:spacing w:before="340" w:after="130"/>
       </w:pPr>
-      <w:bookmarkStart w:id="19" w:name="_Toc240987619"/>
+      <w:bookmarkStart w:id="19" w:name="_Toc241222156"/>
       <w:r>
         <w:rPr>
           <w:color w:val="DC3230"/>
@@ -8122,7 +8212,7 @@
         <w:keepNext/>
         <w:spacing w:before="340" w:after="130"/>
       </w:pPr>
-      <w:bookmarkStart w:id="20" w:name="_Toc240987620"/>
+      <w:bookmarkStart w:id="20" w:name="_Toc241222157"/>
       <w:r>
         <w:rPr>
           <w:color w:val="DC3230"/>
@@ -8489,7 +8579,7 @@
         <w:keepNext/>
         <w:spacing w:before="340" w:after="130"/>
       </w:pPr>
-      <w:bookmarkStart w:id="21" w:name="_Toc240987621"/>
+      <w:bookmarkStart w:id="21" w:name="_Toc241222158"/>
       <w:r>
         <w:rPr>
           <w:color w:val="DC3230"/>
@@ -8615,7 +8705,7 @@
         </w:pBdr>
         <w:spacing w:after="220"/>
       </w:pPr>
-      <w:bookmarkStart w:id="22" w:name="_Toc240987622"/>
+      <w:bookmarkStart w:id="22" w:name="_Toc241222159"/>
       <w:r>
         <w:rPr>
           <w:color w:val="DC3230"/>
@@ -8959,6 +9049,9 @@
           <w:p>
             <w:pPr>
               <w:spacing w:after="0" w:line="264" w:lineRule="auto"/>
+              <w:rPr>
+                <w:lang w:val="en-US"/>
+              </w:rPr>
             </w:pPr>
             <w:r>
               <w:rPr>
@@ -8966,6 +9059,7 @@
                 <w:color w:val="0A5D65"/>
                 <w:sz w:val="17"/>
                 <w:szCs w:val="17"/>
+                <w:lang w:val="en-US"/>
               </w:rPr>
               <w:t>app_users</w:t>
             </w:r>
@@ -8973,6 +9067,7 @@
               <w:rPr>
                 <w:sz w:val="19"/>
                 <w:szCs w:val="19"/>
+                <w:lang w:val="en-US"/>
               </w:rPr>
               <w:t xml:space="preserve">, </w:t>
             </w:r>
@@ -8982,6 +9077,7 @@
                 <w:color w:val="0A5D65"/>
                 <w:sz w:val="17"/>
                 <w:szCs w:val="17"/>
+                <w:lang w:val="en-US"/>
               </w:rPr>
               <w:t>app_user_sedi</w:t>
             </w:r>
@@ -8989,6 +9085,7 @@
               <w:rPr>
                 <w:sz w:val="19"/>
                 <w:szCs w:val="19"/>
+                <w:lang w:val="en-US"/>
               </w:rPr>
               <w:t xml:space="preserve">, </w:t>
             </w:r>
@@ -8998,6 +9095,7 @@
                 <w:color w:val="0A5D65"/>
                 <w:sz w:val="17"/>
                 <w:szCs w:val="17"/>
+                <w:lang w:val="en-US"/>
               </w:rPr>
               <w:t>breakglass_users</w:t>
             </w:r>
@@ -9005,6 +9103,7 @@
               <w:rPr>
                 <w:sz w:val="19"/>
                 <w:szCs w:val="19"/>
+                <w:lang w:val="en-US"/>
               </w:rPr>
               <w:t xml:space="preserve">, </w:t>
             </w:r>
@@ -9014,6 +9113,7 @@
                 <w:color w:val="0A5D65"/>
                 <w:sz w:val="17"/>
                 <w:szCs w:val="17"/>
+                <w:lang w:val="en-US"/>
               </w:rPr>
               <w:t>session</w:t>
             </w:r>
@@ -9110,6 +9210,9 @@
           <w:p>
             <w:pPr>
               <w:spacing w:after="0" w:line="264" w:lineRule="auto"/>
+              <w:rPr>
+                <w:lang w:val="en-US"/>
+              </w:rPr>
             </w:pPr>
             <w:r>
               <w:rPr>
@@ -9117,6 +9220,7 @@
                 <w:color w:val="0A5D65"/>
                 <w:sz w:val="17"/>
                 <w:szCs w:val="17"/>
+                <w:lang w:val="en-US"/>
               </w:rPr>
               <w:t>saml_request_ids</w:t>
             </w:r>
@@ -9124,6 +9228,7 @@
               <w:rPr>
                 <w:sz w:val="19"/>
                 <w:szCs w:val="19"/>
+                <w:lang w:val="en-US"/>
               </w:rPr>
               <w:t xml:space="preserve">, </w:t>
             </w:r>
@@ -9133,6 +9238,7 @@
                 <w:color w:val="0A5D65"/>
                 <w:sz w:val="17"/>
                 <w:szCs w:val="17"/>
+                <w:lang w:val="en-US"/>
               </w:rPr>
               <w:t>sms_config</w:t>
             </w:r>
@@ -9140,6 +9246,7 @@
               <w:rPr>
                 <w:sz w:val="19"/>
                 <w:szCs w:val="19"/>
+                <w:lang w:val="en-US"/>
               </w:rPr>
               <w:t xml:space="preserve">, </w:t>
             </w:r>
@@ -9149,6 +9256,7 @@
                 <w:color w:val="0A5D65"/>
                 <w:sz w:val="17"/>
                 <w:szCs w:val="17"/>
+                <w:lang w:val="en-US"/>
               </w:rPr>
               <w:t>wlc_config</w:t>
             </w:r>
@@ -9317,7 +9425,7 @@
         </w:pBdr>
         <w:spacing w:after="220"/>
       </w:pPr>
-      <w:bookmarkStart w:id="23" w:name="_Toc240987623"/>
+      <w:bookmarkStart w:id="23" w:name="_Toc241222160"/>
       <w:r>
         <w:rPr>
           <w:color w:val="DC3230"/>
@@ -9336,7 +9444,7 @@
         <w:keepNext/>
         <w:spacing w:before="340" w:after="130"/>
       </w:pPr>
-      <w:bookmarkStart w:id="24" w:name="_Toc240987624"/>
+      <w:bookmarkStart w:id="24" w:name="_Toc241222161"/>
       <w:r>
         <w:rPr>
           <w:color w:val="DC3230"/>
@@ -9366,10 +9474,10 @@
         <w:tblLook w:val="04A0" w:firstRow="1" w:lastRow="0" w:firstColumn="1" w:lastColumn="0" w:noHBand="0" w:noVBand="1"/>
       </w:tblPr>
       <w:tblGrid>
-        <w:gridCol w:w="2120"/>
-        <w:gridCol w:w="1349"/>
-        <w:gridCol w:w="3277"/>
-        <w:gridCol w:w="2892"/>
+        <w:gridCol w:w="2110"/>
+        <w:gridCol w:w="1345"/>
+        <w:gridCol w:w="3252"/>
+        <w:gridCol w:w="2931"/>
       </w:tblGrid>
       <w:tr>
         <w:tblPrEx>
@@ -9638,10 +9746,12 @@
             </w:pPr>
             <w:r>
               <w:rPr>
-                <w:sz w:val="19"/>
-                <w:szCs w:val="19"/>
-              </w:rPr>
-              <w:t>guestportal-dev.dompe.com</w:t>
+                <w:rFonts w:ascii="Consolas" w:eastAsia="Consolas" w:hAnsi="Consolas" w:cs="Consolas"/>
+                <w:color w:val="0A5D65"/>
+                <w:sz w:val="17"/>
+                <w:szCs w:val="17"/>
+              </w:rPr>
+              <w:t>https://guestportal-dev.dompe.com</w:t>
             </w:r>
           </w:p>
         </w:tc>
@@ -9779,10 +9889,12 @@
             </w:pPr>
             <w:r>
               <w:rPr>
-                <w:sz w:val="19"/>
-                <w:szCs w:val="19"/>
-              </w:rPr>
-              <w:t>guestportal-stg.dompe.com</w:t>
+                <w:rFonts w:ascii="Consolas" w:eastAsia="Consolas" w:hAnsi="Consolas" w:cs="Consolas"/>
+                <w:color w:val="0A5D65"/>
+                <w:sz w:val="17"/>
+                <w:szCs w:val="17"/>
+              </w:rPr>
+              <w:t>https://guestportal-stg.dompe.com</w:t>
             </w:r>
           </w:p>
         </w:tc>
@@ -9920,10 +10032,12 @@
             </w:pPr>
             <w:r>
               <w:rPr>
-                <w:sz w:val="19"/>
-                <w:szCs w:val="19"/>
-              </w:rPr>
-              <w:t>guestportal.dompe.com</w:t>
+                <w:rFonts w:ascii="Consolas" w:eastAsia="Consolas" w:hAnsi="Consolas" w:cs="Consolas"/>
+                <w:color w:val="0A5D65"/>
+                <w:sz w:val="17"/>
+                <w:szCs w:val="17"/>
+              </w:rPr>
+              <w:t>https://guestportal.dompe.com</w:t>
             </w:r>
           </w:p>
         </w:tc>
@@ -9975,7 +10089,7 @@
         <w:keepNext/>
         <w:spacing w:before="340" w:after="130"/>
       </w:pPr>
-      <w:bookmarkStart w:id="25" w:name="_Toc240987625"/>
+      <w:bookmarkStart w:id="25" w:name="_Toc241222162"/>
       <w:r>
         <w:rPr>
           <w:color w:val="DC3230"/>
@@ -9997,10 +10111,10 @@
           <w:noProof/>
         </w:rPr>
         <w:drawing>
-          <wp:inline distT="0" distB="0" distL="0" distR="0" wp14:anchorId="5FF99821" wp14:editId="054E1969">
+          <wp:inline distT="0" distB="0" distL="0" distR="0" wp14:anchorId="731C80D8" wp14:editId="2787C1D3">
             <wp:extent cx="6096000" cy="2895600"/>
             <wp:effectExtent l="0" t="0" r="0" b="0"/>
-            <wp:docPr id="1433917583" name="Immagine 1433917583"/>
+            <wp:docPr id="186942415" name="Immagine 186942415"/>
             <wp:cNvGraphicFramePr>
               <a:graphicFrameLocks xmlns:a="http://schemas.openxmlformats.org/drawingml/2006/main" noChangeAspect="1"/>
             </wp:cNvGraphicFramePr>
@@ -10083,7 +10197,7 @@
         <w:keepNext/>
         <w:spacing w:before="340" w:after="130"/>
       </w:pPr>
-      <w:bookmarkStart w:id="26" w:name="_Toc240987626"/>
+      <w:bookmarkStart w:id="26" w:name="_Toc241222163"/>
       <w:r>
         <w:rPr>
           <w:color w:val="DC3230"/>
@@ -10128,7 +10242,7 @@
         <w:keepNext/>
         <w:spacing w:before="340" w:after="130"/>
       </w:pPr>
-      <w:bookmarkStart w:id="27" w:name="_Toc240987627"/>
+      <w:bookmarkStart w:id="27" w:name="_Toc241222164"/>
       <w:r>
         <w:rPr>
           <w:color w:val="DC3230"/>
@@ -10178,7 +10292,7 @@
         </w:pBdr>
         <w:spacing w:after="220"/>
       </w:pPr>
-      <w:bookmarkStart w:id="28" w:name="_Toc240987628"/>
+      <w:bookmarkStart w:id="28" w:name="_Toc241222165"/>
       <w:r>
         <w:rPr>
           <w:color w:val="DC3230"/>
@@ -11215,7 +11329,7 @@
         </w:pBdr>
         <w:spacing w:after="220"/>
       </w:pPr>
-      <w:bookmarkStart w:id="29" w:name="_Toc240987629"/>
+      <w:bookmarkStart w:id="29" w:name="_Toc241222166"/>
       <w:r>
         <w:rPr>
           <w:color w:val="DC3230"/>
@@ -12544,7 +12658,7 @@
         </w:pBdr>
         <w:spacing w:after="220"/>
       </w:pPr>
-      <w:bookmarkStart w:id="30" w:name="_Toc240987630"/>
+      <w:bookmarkStart w:id="30" w:name="_Toc241222167"/>
       <w:r>
         <w:rPr>
           <w:color w:val="DC3230"/>
@@ -13045,7 +13159,7 @@
         <w:keepNext/>
         <w:spacing w:before="340" w:after="130"/>
       </w:pPr>
-      <w:bookmarkStart w:id="31" w:name="_Toc240987631"/>
+      <w:bookmarkStart w:id="31" w:name="_Toc241222168"/>
       <w:r>
         <w:rPr>
           <w:color w:val="DC3230"/>
@@ -13127,7 +13241,7 @@
         </w:pBdr>
         <w:spacing w:after="220"/>
       </w:pPr>
-      <w:bookmarkStart w:id="32" w:name="_Toc240987632"/>
+      <w:bookmarkStart w:id="32" w:name="_Toc241222169"/>
       <w:r>
         <w:rPr>
           <w:color w:val="DC3230"/>
@@ -14194,10 +14308,10 @@
         <w:noProof/>
       </w:rPr>
       <w:drawing>
-        <wp:inline distT="0" distB="0" distL="0" distR="0" wp14:anchorId="69FBA8F1" wp14:editId="768D0D06">
+        <wp:inline distT="0" distB="0" distL="0" distR="0" wp14:anchorId="3D5ACAF5" wp14:editId="5F28F04B">
           <wp:extent cx="904875" cy="352425"/>
           <wp:effectExtent l="0" t="0" r="0" b="0"/>
-          <wp:docPr id="1523060018" name="Immagine 1523060018"/>
+          <wp:docPr id="2064783131" name="Immagine 2064783131"/>
           <wp:cNvGraphicFramePr>
             <a:graphicFrameLocks xmlns:a="http://schemas.openxmlformats.org/drawingml/2006/main" noChangeAspect="1"/>
           </wp:cNvGraphicFramePr>
@@ -14245,10 +14359,10 @@
 <file path=word/numbering.xml><?xml version="1.0" encoding="utf-8"?>
 <w:numbering xmlns:wpc="http://schemas.microsoft.com/office/word/2010/wordprocessingCanvas" xmlns:cx="http://schemas.microsoft.com/office/drawing/2014/chartex" xmlns:cx1="http://schemas.microsoft.com/office/drawing/2015/9/8/chartex" xmlns:cx2="http://schemas.microsoft.com/office/drawing/2015/10/21/chartex" xmlns:cx3="http://schemas.microsoft.com/office/drawing/2016/5/9/chartex" xmlns:cx4="http://schemas.microsoft.com/office/drawing/2016/5/10/chartex" xmlns:cx5="http://schemas.microsoft.com/office/drawing/2016/5/11/chartex" xmlns:cx6="http://schemas.microsoft.com/office/drawing/2016/5/12/chartex" xmlns:cx7="http://schemas.microsoft.com/office/drawing/2016/5/13/chartex" xmlns:cx8="http://schemas.microsoft.com/office/drawing/2016/5/14/chartex" xmlns:mc="http://schemas.openxmlformats.org/markup-compatibility/2006" xmlns:aink="http://schemas.microsoft.com/office/drawing/2016/ink" xmlns:am3d="http://schemas.microsoft.com/office/drawing/2017/model3d" xmlns:o="urn:schemas-microsoft-com:office:office" xmlns:oel="http://schemas.microsoft.com/office/2019/extlst" xmlns:r="http://schemas.openxmlformats.org/officeDocument/2006/relationships" xmlns:m="http://schemas.openxmlformats.org/officeDocument/2006/math" xmlns:v="urn:schemas-microsoft-com:vml" xmlns:wp14="http://schemas.microsoft.com/office/word/2010/wordprocessingDrawing" xmlns:wp="http://schemas.openxmlformats.org/drawingml/2006/wordprocessingDrawing" xmlns:w10="urn:schemas-microsoft-com:office:word" xmlns:w="http://schemas.openxmlformats.org/wordprocessingml/2006/main" xmlns:w14="http://schemas.microsoft.com/office/word/2010/wordml" xmlns:w15="http://schemas.microsoft.com/office/word/2012/wordml" xmlns:w16cex="http://schemas.microsoft.com/office/word/2018/wordml/cex" xmlns:w16cid="http://schemas.microsoft.com/office/word/2016/wordml/cid" xmlns:w16="http://schemas.microsoft.com/office/word/2018/wordml" xmlns:w16du="http://schemas.microsoft.com/office/word/2023/wordml/word16du" xmlns:w16sdtdh="http://schemas.microsoft.com/office/word/2020/wordml/sdtdatahash" xmlns:w16sdtfl="http://schemas.microsoft.com/office/word/2024/wordml/sdtformatlock" xmlns:w16se="http://schemas.microsoft.com/office/word/2015/wordml/symex" xmlns:wpg="http://schemas.microsoft.com/office/word/2010/wordprocessingGroup" xmlns:wpi="http://schemas.microsoft.com/office/word/2010/wordprocessingInk" xmlns:wne="http://schemas.microsoft.com/office/word/2006/wordml" xmlns:wps="http://schemas.microsoft.com/office/word/2010/wordprocessingShape" mc:Ignorable="w14 w15 w16se w16cid w16 w16cex w16sdtdh w16sdtfl w16du wp14">
   <w:abstractNum w:abstractNumId="0" w15:restartNumberingAfterBreak="0">
-    <w:nsid w:val="17EF6434"/>
+    <w:nsid w:val="16712D50"/>
     <w:multiLevelType w:val="hybridMultilevel"/>
-    <w:tmpl w:val="CEECB02E"/>
-    <w:lvl w:ilvl="0" w:tplc="6B3E82AA">
+    <w:tmpl w:val="1EE6A06E"/>
+    <w:lvl w:ilvl="0" w:tplc="4E6839EC">
       <w:start w:val="1"/>
       <w:numFmt w:val="bullet"/>
       <w:lvlText w:val="●"/>
@@ -14263,7 +14377,7 @@
         <w:szCs w:val="14"/>
       </w:rPr>
     </w:lvl>
-    <w:lvl w:ilvl="1" w:tplc="2C2CFC7C">
+    <w:lvl w:ilvl="1" w:tplc="5C72E07C">
       <w:start w:val="1"/>
       <w:numFmt w:val="bullet"/>
       <w:lvlText w:val="–"/>
@@ -14276,47 +14390,47 @@
         <w:color w:val="0A5D65"/>
       </w:rPr>
     </w:lvl>
-    <w:lvl w:ilvl="2" w:tplc="EF1A4898">
+    <w:lvl w:ilvl="2" w:tplc="90407ADE">
       <w:numFmt w:val="decimal"/>
       <w:lvlText w:val=""/>
       <w:lvlJc w:val="left"/>
     </w:lvl>
-    <w:lvl w:ilvl="3" w:tplc="4A08950E">
+    <w:lvl w:ilvl="3" w:tplc="1BB8A52C">
       <w:numFmt w:val="decimal"/>
       <w:lvlText w:val=""/>
       <w:lvlJc w:val="left"/>
     </w:lvl>
-    <w:lvl w:ilvl="4" w:tplc="BC86E654">
+    <w:lvl w:ilvl="4" w:tplc="11E86BA2">
       <w:numFmt w:val="decimal"/>
       <w:lvlText w:val=""/>
       <w:lvlJc w:val="left"/>
     </w:lvl>
-    <w:lvl w:ilvl="5" w:tplc="C3F4ED0E">
+    <w:lvl w:ilvl="5" w:tplc="8FD2F9AE">
       <w:numFmt w:val="decimal"/>
       <w:lvlText w:val=""/>
       <w:lvlJc w:val="left"/>
     </w:lvl>
-    <w:lvl w:ilvl="6" w:tplc="C6DA5016">
+    <w:lvl w:ilvl="6" w:tplc="2752D35C">
       <w:numFmt w:val="decimal"/>
       <w:lvlText w:val=""/>
       <w:lvlJc w:val="left"/>
     </w:lvl>
-    <w:lvl w:ilvl="7" w:tplc="DB6E886E">
+    <w:lvl w:ilvl="7" w:tplc="F1447C06">
       <w:numFmt w:val="decimal"/>
       <w:lvlText w:val=""/>
       <w:lvlJc w:val="left"/>
     </w:lvl>
-    <w:lvl w:ilvl="8" w:tplc="50DC9742">
+    <w:lvl w:ilvl="8" w:tplc="7ADA5D98">
       <w:numFmt w:val="decimal"/>
       <w:lvlText w:val=""/>
       <w:lvlJc w:val="left"/>
     </w:lvl>
   </w:abstractNum>
   <w:abstractNum w:abstractNumId="1" w15:restartNumberingAfterBreak="0">
-    <w:nsid w:val="6C8F66FF"/>
+    <w:nsid w:val="28795CF4"/>
     <w:multiLevelType w:val="hybridMultilevel"/>
-    <w:tmpl w:val="B7BA0328"/>
-    <w:lvl w:ilvl="0" w:tplc="6C2C3B9A">
+    <w:tmpl w:val="B8785452"/>
+    <w:lvl w:ilvl="0" w:tplc="21E495FC">
       <w:start w:val="1"/>
       <w:numFmt w:val="bullet"/>
       <w:lvlText w:val="●"/>
@@ -14325,7 +14439,7 @@
         <w:ind w:left="720" w:hanging="360"/>
       </w:pPr>
     </w:lvl>
-    <w:lvl w:ilvl="1" w:tplc="FA8422A4">
+    <w:lvl w:ilvl="1" w:tplc="4CE2E728">
       <w:start w:val="1"/>
       <w:numFmt w:val="bullet"/>
       <w:lvlText w:val="○"/>
@@ -14334,7 +14448,7 @@
         <w:ind w:left="1440" w:hanging="360"/>
       </w:pPr>
     </w:lvl>
-    <w:lvl w:ilvl="2" w:tplc="56A42224">
+    <w:lvl w:ilvl="2" w:tplc="74265D44">
       <w:start w:val="1"/>
       <w:numFmt w:val="bullet"/>
       <w:lvlText w:val="■"/>
@@ -14343,7 +14457,7 @@
         <w:ind w:left="2160" w:hanging="360"/>
       </w:pPr>
     </w:lvl>
-    <w:lvl w:ilvl="3" w:tplc="3666360E">
+    <w:lvl w:ilvl="3" w:tplc="5D2243CA">
       <w:start w:val="1"/>
       <w:numFmt w:val="bullet"/>
       <w:lvlText w:val="●"/>
@@ -14352,7 +14466,7 @@
         <w:ind w:left="2880" w:hanging="360"/>
       </w:pPr>
     </w:lvl>
-    <w:lvl w:ilvl="4" w:tplc="226A9C4A">
+    <w:lvl w:ilvl="4" w:tplc="FA08D094">
       <w:start w:val="1"/>
       <w:numFmt w:val="bullet"/>
       <w:lvlText w:val="○"/>
@@ -14361,7 +14475,7 @@
         <w:ind w:left="3600" w:hanging="360"/>
       </w:pPr>
     </w:lvl>
-    <w:lvl w:ilvl="5" w:tplc="69B0E2BC">
+    <w:lvl w:ilvl="5" w:tplc="4AEEE6F0">
       <w:start w:val="1"/>
       <w:numFmt w:val="bullet"/>
       <w:lvlText w:val="■"/>
@@ -14370,7 +14484,7 @@
         <w:ind w:left="4320" w:hanging="360"/>
       </w:pPr>
     </w:lvl>
-    <w:lvl w:ilvl="6" w:tplc="DD2A194A">
+    <w:lvl w:ilvl="6" w:tplc="4596DFB4">
       <w:start w:val="1"/>
       <w:numFmt w:val="bullet"/>
       <w:lvlText w:val="●"/>
@@ -14379,7 +14493,7 @@
         <w:ind w:left="5040" w:hanging="360"/>
       </w:pPr>
     </w:lvl>
-    <w:lvl w:ilvl="7" w:tplc="6E3A0BBE">
+    <w:lvl w:ilvl="7" w:tplc="AE826114">
       <w:start w:val="1"/>
       <w:numFmt w:val="bullet"/>
       <w:lvlText w:val="●"/>
@@ -14388,7 +14502,7 @@
         <w:ind w:left="5760" w:hanging="360"/>
       </w:pPr>
     </w:lvl>
-    <w:lvl w:ilvl="8" w:tplc="CF268176">
+    <w:lvl w:ilvl="8" w:tplc="AFB06820">
       <w:start w:val="1"/>
       <w:numFmt w:val="bullet"/>
       <w:lvlText w:val="●"/>
@@ -14399,10 +14513,10 @@
     </w:lvl>
   </w:abstractNum>
   <w:abstractNum w:abstractNumId="2" w15:restartNumberingAfterBreak="0">
-    <w:nsid w:val="718722DB"/>
+    <w:nsid w:val="601A1863"/>
     <w:multiLevelType w:val="hybridMultilevel"/>
-    <w:tmpl w:val="AD04E9D4"/>
-    <w:lvl w:ilvl="0" w:tplc="2D8A7FA2">
+    <w:tmpl w:val="7EC24390"/>
+    <w:lvl w:ilvl="0" w:tplc="627224C8">
       <w:start w:val="1"/>
       <w:numFmt w:val="decimal"/>
       <w:lvlText w:val="%1."/>
@@ -14417,7 +14531,7 @@
         <w:color w:val="DC3230"/>
       </w:rPr>
     </w:lvl>
-    <w:lvl w:ilvl="1" w:tplc="0B868028">
+    <w:lvl w:ilvl="1" w:tplc="697890C2">
       <w:start w:val="1"/>
       <w:numFmt w:val="lowerLetter"/>
       <w:lvlText w:val="%2."/>
@@ -14432,61 +14546,61 @@
         <w:color w:val="0A5D65"/>
       </w:rPr>
     </w:lvl>
-    <w:lvl w:ilvl="2" w:tplc="DDAEF320">
+    <w:lvl w:ilvl="2" w:tplc="F8743540">
       <w:numFmt w:val="decimal"/>
       <w:lvlText w:val=""/>
       <w:lvlJc w:val="left"/>
     </w:lvl>
-    <w:lvl w:ilvl="3" w:tplc="A34AE716">
+    <w:lvl w:ilvl="3" w:tplc="6AE2E98E">
       <w:numFmt w:val="decimal"/>
       <w:lvlText w:val=""/>
       <w:lvlJc w:val="left"/>
     </w:lvl>
-    <w:lvl w:ilvl="4" w:tplc="D8303BD6">
+    <w:lvl w:ilvl="4" w:tplc="99889976">
       <w:numFmt w:val="decimal"/>
       <w:lvlText w:val=""/>
       <w:lvlJc w:val="left"/>
     </w:lvl>
-    <w:lvl w:ilvl="5" w:tplc="DABA8C80">
+    <w:lvl w:ilvl="5" w:tplc="F2822EAA">
       <w:numFmt w:val="decimal"/>
       <w:lvlText w:val=""/>
       <w:lvlJc w:val="left"/>
     </w:lvl>
-    <w:lvl w:ilvl="6" w:tplc="9288E4C0">
+    <w:lvl w:ilvl="6" w:tplc="7C3C9186">
       <w:numFmt w:val="decimal"/>
       <w:lvlText w:val=""/>
       <w:lvlJc w:val="left"/>
     </w:lvl>
-    <w:lvl w:ilvl="7" w:tplc="499EAA3C">
+    <w:lvl w:ilvl="7" w:tplc="6CD83C62">
       <w:numFmt w:val="decimal"/>
       <w:lvlText w:val=""/>
       <w:lvlJc w:val="left"/>
     </w:lvl>
-    <w:lvl w:ilvl="8" w:tplc="6A9C4F74">
+    <w:lvl w:ilvl="8" w:tplc="E18C4830">
       <w:numFmt w:val="decimal"/>
       <w:lvlText w:val=""/>
       <w:lvlJc w:val="left"/>
     </w:lvl>
   </w:abstractNum>
-  <w:num w:numId="1" w16cid:durableId="739639677">
+  <w:num w:numId="1" w16cid:durableId="1704791478">
     <w:abstractNumId w:val="1"/>
     <w:lvlOverride w:ilvl="0">
       <w:startOverride w:val="1"/>
     </w:lvlOverride>
   </w:num>
-  <w:num w:numId="2" w16cid:durableId="89856584">
+  <w:num w:numId="2" w16cid:durableId="1221139857">
     <w:abstractNumId w:val="0"/>
     <w:lvlOverride w:ilvl="0">
       <w:startOverride w:val="1"/>
     </w:lvlOverride>
   </w:num>
-  <w:num w:numId="3" w16cid:durableId="759371530">
+  <w:num w:numId="3" w16cid:durableId="1060909583">
     <w:abstractNumId w:val="2"/>
     <w:lvlOverride w:ilvl="0">
       <w:startOverride w:val="1"/>
     </w:lvlOverride>
   </w:num>
-  <w:num w:numId="4" w16cid:durableId="1115952053">
+  <w:num w:numId="4" w16cid:durableId="939531425">
     <w:abstractNumId w:val="2"/>
     <w:lvlOverride w:ilvl="0">
       <w:startOverride w:val="1"/>
@@ -15132,7 +15246,7 @@
     <w:autoRedefine/>
     <w:uiPriority w:val="39"/>
     <w:unhideWhenUsed/>
-    <w:rsid w:val="00F90D08"/>
+    <w:rsid w:val="00E32ED3"/>
     <w:pPr>
       <w:spacing w:after="100"/>
     </w:pPr>
@@ -15144,7 +15258,7 @@
     <w:autoRedefine/>
     <w:uiPriority w:val="39"/>
     <w:unhideWhenUsed/>
-    <w:rsid w:val="00F90D08"/>
+    <w:rsid w:val="00E32ED3"/>
     <w:pPr>
       <w:spacing w:after="100"/>
       <w:ind w:left="210"/>

</xml_diff>